<commit_message>
update the my resume
</commit_message>
<xml_diff>
--- a/Suriya_Software Developer_Resume.docx
+++ b/Suriya_Software Developer_Resume.docx
@@ -129,18 +129,21 @@
           <w:sz w:val="19"/>
           <w:szCs w:val="19"/>
         </w:rPr>
-        <w:t>create | Suriya-portfolio-</w:t>
-      </w:r>
-      <w:proofErr w:type="spellStart"/>
-      <w:r>
-        <w:rPr>
-          <w:color w:val="555555"/>
-          <w:sz w:val="19"/>
-          <w:szCs w:val="19"/>
-        </w:rPr>
-        <w:t>dev.netlify.app</w:t>
-      </w:r>
-      <w:proofErr w:type="spellEnd"/>
+        <w:t>create |</w:t>
+      </w:r>
+      <w:hyperlink r:id="rId5" w:history="1">
+        <w:r>
+          <w:rPr>
+            <w:rStyle w:val="Hyperlink"/>
+            <w:sz w:val="19"/>
+            <w:szCs w:val="19"/>
+          </w:rPr>
+          <w:t>https://suriya-create.github.io/Portfolio-Website</w:t>
+        </w:r>
+      </w:hyperlink>
+      <w:r>
+        <w:t xml:space="preserve"> </w:t>
+      </w:r>
     </w:p>
     <w:p>
       <w:pPr>
@@ -840,25 +843,13 @@
         <w:spacing w:after="60"/>
       </w:pPr>
       <w:r>
-        <w:t>Centimetre</w:t>
-      </w:r>
-      <w:r>
-        <w:t xml:space="preserve"> to Meter Converter</w:t>
+        <w:t>Centimetre to Meter Converter</w:t>
       </w:r>
       <w:r>
         <w:t xml:space="preserve"> - </w:t>
       </w:r>
       <w:r>
-        <w:t xml:space="preserve">Created a responsive web application that converts </w:t>
-      </w:r>
-      <w:r>
-        <w:t>centimetre</w:t>
-      </w:r>
-      <w:r>
-        <w:t xml:space="preserve"> values into meters instantly. Utilized JavaScript for calculations and designed a user-friendly interface using HTML and CSS.</w:t>
-      </w:r>
-      <w:r>
-        <w:t xml:space="preserve"> </w:t>
+        <w:t xml:space="preserve">Created a responsive web application that converts centimetre values into meters instantly. Utilized JavaScript for calculations and designed a user-friendly interface using HTML and CSS. </w:t>
       </w:r>
     </w:p>
     <w:p>
@@ -880,10 +871,7 @@
         <w:t>Toss the Coin</w:t>
       </w:r>
       <w:r>
-        <w:t xml:space="preserve"> </w:t>
-      </w:r>
-      <w:r>
-        <w:t xml:space="preserve">- </w:t>
+        <w:t xml:space="preserve"> - </w:t>
       </w:r>
       <w:r>
         <w:t>Built a coin toss simulator that generates random Heads or Tails outcomes. Implemented event handling and dynamic result display using JavaScript.</w:t>
@@ -908,16 +896,10 @@
         <w:t>To-Do List Application</w:t>
       </w:r>
       <w:r>
-        <w:t xml:space="preserve"> </w:t>
-      </w:r>
-      <w:r>
-        <w:t>-</w:t>
-      </w:r>
-      <w:r>
-        <w:t xml:space="preserve"> </w:t>
-      </w:r>
-      <w:r>
-        <w:t>Developed a task management application with features to add, delete, and mark tasks as completed. Used DOM manipulation and Local Storage for efficient task management and data persistence.</w:t>
+        <w:t xml:space="preserve"> -</w:t>
+      </w:r>
+      <w:r>
+        <w:t xml:space="preserve"> Developed a task management application with features to add, delete, and mark tasks as completed. Used DOM manipulation and Local Storage for efficient task management and data persistence.</w:t>
       </w:r>
     </w:p>
     <w:p>
@@ -939,10 +921,7 @@
         <w:t>Stone Paper Scissors Game</w:t>
       </w:r>
       <w:r>
-        <w:t xml:space="preserve"> </w:t>
-      </w:r>
-      <w:r>
-        <w:t xml:space="preserve">- </w:t>
+        <w:t xml:space="preserve"> - </w:t>
       </w:r>
       <w:r>
         <w:t>Designed and developed a browser-based game where users compete against the computer. Implemented game logic, score tracking, and result evaluation using JavaScript.</w:t>
@@ -967,10 +946,7 @@
         <w:t>Calculator</w:t>
       </w:r>
       <w:r>
-        <w:t xml:space="preserve"> </w:t>
-      </w:r>
-      <w:r>
-        <w:t>-</w:t>
+        <w:t xml:space="preserve"> -</w:t>
       </w:r>
       <w:r>
         <w:t xml:space="preserve"> Created a web-based calculator capable of performing basic arithmetic operations including addition, subtraction, multiplication, and division. Implemented input validation and responsive user interface design.</w:t>
@@ -2184,6 +2160,7 @@
   <w:style w:type="character" w:default="1" w:styleId="DefaultParagraphFont">
     <w:name w:val="Default Paragraph Font"/>
     <w:uiPriority w:val="1"/>
+    <w:semiHidden/>
     <w:unhideWhenUsed/>
   </w:style>
   <w:style w:type="table" w:default="1" w:styleId="TableNormal">
@@ -2256,6 +2233,29 @@
       <w:color w:val="666666"/>
       <w:sz w:val="48"/>
       <w:szCs w:val="48"/>
+    </w:rPr>
+  </w:style>
+  <w:style w:type="character" w:styleId="Hyperlink">
+    <w:name w:val="Hyperlink"/>
+    <w:basedOn w:val="DefaultParagraphFont"/>
+    <w:uiPriority w:val="99"/>
+    <w:unhideWhenUsed/>
+    <w:rsid w:val="008B1CBF"/>
+    <w:rPr>
+      <w:color w:val="0000FF" w:themeColor="hyperlink"/>
+      <w:u w:val="single"/>
+    </w:rPr>
+  </w:style>
+  <w:style w:type="character" w:styleId="UnresolvedMention">
+    <w:name w:val="Unresolved Mention"/>
+    <w:basedOn w:val="DefaultParagraphFont"/>
+    <w:uiPriority w:val="99"/>
+    <w:semiHidden/>
+    <w:unhideWhenUsed/>
+    <w:rsid w:val="008B1CBF"/>
+    <w:rPr>
+      <w:color w:val="605E5C"/>
+      <w:shd w:val="clear" w:color="auto" w:fill="E1DFDD"/>
     </w:rPr>
   </w:style>
 </w:styles>

</xml_diff>